<commit_message>
Returns policy draft v2 after comparing five AU shelving retailers
Co-Authored-By: Claude Sonnet 5.5 <noreply@anthropic.com>
</commit_message>
<xml_diff>
--- a/docs/policy-drafts/returns-policy.docx
+++ b/docs/policy-drafts/returns-policy.docx
@@ -35,7 +35,7 @@
           <w:sz w:val="20"/>
           <w:szCs w:val="20"/>
         </w:rPr>
-        <w:t xml:space="preserve">Draft for review.</w:t>
+        <w:t xml:space="preserve">Draft for review (version 2).</w:t>
       </w:r>
       <w:r>
         <w:rPr>
@@ -43,7 +43,7 @@
           <w:sz w:val="20"/>
           <w:szCs w:val="20"/>
         </w:rPr>
-        <w:t xml:space="preserve"> Written from the returns information already on the Super Shelving FAQs page and in our Terms of Service. Anything in </w:t>
+        <w:t xml:space="preserve"> Written from the returns information on the Super Shelving FAQs page and in our Terms of Service, and updated after comparing five Australian shelving retailers' returns policies. Anything in </w:t>
       </w:r>
       <w:r>
         <w:rPr>
@@ -62,7 +62,7 @@
           <w:sz w:val="20"/>
           <w:szCs w:val="20"/>
         </w:rPr>
-        <w:t xml:space="preserve"> is a placeholder or an assumption to confirm. Not legal advice - have it checked before publishing, especially sections 1 and 4.</w:t>
+        <w:t xml:space="preserve"> is a placeholder or an assumption to confirm. Not legal advice - have it checked before publishing, especially sections 1, 4 and 6.</w:t>
       </w:r>
     </w:p>
     <w:p>
@@ -128,7 +128,7 @@
         <w:rPr>
           <w:rFonts w:ascii="Arial" w:cs="Arial" w:eastAsia="Arial" w:hAnsi="Arial"/>
         </w:rPr>
-        <w:t xml:space="preserve">Nothing in this policy limits those rights.</w:t>
+        <w:t xml:space="preserve">Nothing in this policy limits those rights. Any time limits, packaging rules or conditions in this policy do not apply to your rights if a product is faulty.</w:t>
       </w:r>
     </w:p>
     <w:p>
@@ -156,7 +156,7 @@
         <w:rPr>
           <w:rFonts w:ascii="Arial" w:cs="Arial" w:eastAsia="Arial" w:hAnsi="Arial"/>
         </w:rPr>
-        <w:t xml:space="preserve">If you change your mind or you are not satisfied with your purchase, you can return it to us within </w:t>
+        <w:t xml:space="preserve">If you change your mind or are not satisfied with your purchase, you can return it to us within </w:t>
       </w:r>
       <w:r>
         <w:rPr>
@@ -186,21 +186,21 @@
         <w:rPr>
           <w:rFonts w:ascii="Arial" w:cs="Arial" w:eastAsia="Arial" w:hAnsi="Arial"/>
         </w:rPr>
-        <w:t xml:space="preserve">the product is in its </w:t>
-      </w:r>
-      <w:r>
-        <w:rPr>
-          <w:rFonts w:ascii="Arial" w:cs="Arial" w:eastAsia="Arial" w:hAnsi="Arial"/>
-          <w:b/>
-          <w:bCs/>
-        </w:rPr>
-        <w:t xml:space="preserve">original condition</w:t>
-      </w:r>
-      <w:r>
-        <w:rPr>
-          <w:rFonts w:ascii="Arial" w:cs="Arial" w:eastAsia="Arial" w:hAnsi="Arial"/>
-        </w:rPr>
-        <w:t xml:space="preserve">, unused and undamaged </w:t>
+        <w:t xml:space="preserve">the product is </w:t>
+      </w:r>
+      <w:r>
+        <w:rPr>
+          <w:rFonts w:ascii="Arial" w:cs="Arial" w:eastAsia="Arial" w:hAnsi="Arial"/>
+          <w:b/>
+          <w:bCs/>
+        </w:rPr>
+        <w:t xml:space="preserve">unused, unassembled and in its original packaging</w:t>
+      </w:r>
+      <w:r>
+        <w:rPr>
+          <w:rFonts w:ascii="Arial" w:cs="Arial" w:eastAsia="Arial" w:hAnsi="Arial"/>
+        </w:rPr>
+        <w:t xml:space="preserve">, with all parts, fittings and manuals </w:t>
       </w:r>
       <w:r>
         <w:rPr>
@@ -209,7 +209,7 @@
           <w:bCs/>
           <w:shd w:fill="FFF2B3" w:color="auto" w:val="clear"/>
         </w:rPr>
-        <w:t xml:space="preserve">[CONFIRM: and in its original packaging; and whether assembled items can be returned]</w:t>
+        <w:t xml:space="preserve">[CONFIRM: unassembled only?]</w:t>
       </w:r>
     </w:p>
     <w:p>
@@ -225,7 +225,15 @@
         <w:rPr>
           <w:rFonts w:ascii="Arial" w:cs="Arial" w:eastAsia="Arial" w:hAnsi="Arial"/>
         </w:rPr>
-        <w:t xml:space="preserve">you contact us within the 14 days to arrange the return</w:t>
+        <w:t xml:space="preserve">you contact us within the 14 days and </w:t>
+      </w:r>
+      <w:r>
+        <w:rPr>
+          <w:rFonts w:ascii="Arial" w:cs="Arial" w:eastAsia="Arial" w:hAnsi="Arial"/>
+          <w:b/>
+          <w:bCs/>
+        </w:rPr>
+        <w:t xml:space="preserve">wait for our return instructions before sending anything back</w:t>
       </w:r>
     </w:p>
     <w:p>
@@ -252,7 +260,7 @@
         <w:rPr>
           <w:rFonts w:ascii="Arial" w:cs="Arial" w:eastAsia="Arial" w:hAnsi="Arial"/>
         </w:rPr>
-        <w:t xml:space="preserve">Items with wear or damage do not qualify for a change-of-mind return.</w:t>
+        <w:t xml:space="preserve">Products that are worn, damaged, modified, assembled or missing parts do not qualify for a change-of-mind return.</w:t>
       </w:r>
     </w:p>
     <w:p>
@@ -281,7 +289,7 @@
         <w:rPr>
           <w:rFonts w:ascii="Arial" w:cs="Arial" w:eastAsia="Arial" w:hAnsi="Arial"/>
         </w:rPr>
-        <w:t xml:space="preserve">You send the goods back to us at your own cost, unless you collected them from our warehouse and bring them back in person.</w:t>
+        <w:t xml:space="preserve">You pay to send the goods back to us, unless you collected them from our warehouse and bring them back in person.</w:t>
       </w:r>
     </w:p>
     <w:p>
@@ -297,7 +305,7 @@
         <w:rPr>
           <w:rFonts w:ascii="Arial" w:cs="Arial" w:eastAsia="Arial" w:hAnsi="Arial"/>
         </w:rPr>
-        <w:t xml:space="preserve">We refund the full purchase price, less the </w:t>
+        <w:t xml:space="preserve">We refund the purchase price, less the </w:t>
       </w:r>
       <w:r>
         <w:rPr>
@@ -311,7 +319,24 @@
         <w:rPr>
           <w:rFonts w:ascii="Arial" w:cs="Arial" w:eastAsia="Arial" w:hAnsi="Arial"/>
         </w:rPr>
-        <w:t xml:space="preserve"> we paid to send the order to you.</w:t>
+        <w:t xml:space="preserve"> we paid to send the order to you. </w:t>
+      </w:r>
+      <w:r>
+        <w:rPr>
+          <w:rFonts w:ascii="Arial" w:cs="Arial" w:eastAsia="Arial" w:hAnsi="Arial"/>
+          <w:b/>
+          <w:bCs/>
+          <w:shd w:fill="FFF2B3" w:color="auto" w:val="clear"/>
+        </w:rPr>
+        <w:t xml:space="preserve">[OPTIONAL: and less a restocking fee of [X]</w:t>
+      </w:r>
+      <w:r>
+        <w:rPr>
+          <w:rFonts w:ascii="Arial" w:cs="Arial" w:eastAsia="Arial" w:hAnsi="Arial"/>
+          <w:b/>
+          <w:bCs/>
+        </w:rPr>
+        <w:t xml:space="preserve">% - other retailers charge 20-30%. Delete this line if you don't want a fee.]</w:t>
       </w:r>
     </w:p>
     <w:p>
@@ -327,7 +352,37 @@
         <w:rPr>
           <w:rFonts w:ascii="Arial" w:cs="Arial" w:eastAsia="Arial" w:hAnsi="Arial"/>
         </w:rPr>
-        <w:t xml:space="preserve">We refund to the </w:t>
+        <w:t xml:space="preserve">Once your return arrives we </w:t>
+      </w:r>
+      <w:r>
+        <w:rPr>
+          <w:rFonts w:ascii="Arial" w:cs="Arial" w:eastAsia="Arial" w:hAnsi="Arial"/>
+          <w:b/>
+          <w:bCs/>
+        </w:rPr>
+        <w:t xml:space="preserve">inspect it</w:t>
+      </w:r>
+      <w:r>
+        <w:rPr>
+          <w:rFonts w:ascii="Arial" w:cs="Arial" w:eastAsia="Arial" w:hAnsi="Arial"/>
+        </w:rPr>
+        <w:t xml:space="preserve">. If goods are damaged, or parts are missing, or they were poorly packed and damaged on the way back, we may deduct a reasonable amount for the loss.</w:t>
+      </w:r>
+    </w:p>
+    <w:p>
+      <w:pPr>
+        <w:pStyle w:val="ListParagraph"/>
+        <w:numPr>
+          <w:ilvl w:val="0"/>
+          <w:numId w:val="2"/>
+        </w:numPr>
+        <w:spacing w:after="100" w:line="300"/>
+      </w:pPr>
+      <w:r>
+        <w:rPr>
+          <w:rFonts w:ascii="Arial" w:cs="Arial" w:eastAsia="Arial" w:hAnsi="Arial"/>
+        </w:rPr>
+        <w:t xml:space="preserve">We refund to your </w:t>
       </w:r>
       <w:r>
         <w:rPr>
@@ -348,23 +403,29 @@
           <w:rFonts w:ascii="Arial" w:cs="Arial" w:eastAsia="Arial" w:hAnsi="Arial"/>
           <w:b/>
           <w:bCs/>
+        </w:rPr>
+        <w:t xml:space="preserve">5 business days</w:t>
+      </w:r>
+      <w:r>
+        <w:rPr>
+          <w:rFonts w:ascii="Arial" w:cs="Arial" w:eastAsia="Arial" w:hAnsi="Arial"/>
+        </w:rPr>
+        <w:t xml:space="preserve"> of approving the refund </w:t>
+      </w:r>
+      <w:r>
+        <w:rPr>
+          <w:rFonts w:ascii="Arial" w:cs="Arial" w:eastAsia="Arial" w:hAnsi="Arial"/>
+          <w:b/>
+          <w:bCs/>
           <w:shd w:fill="FFF2B3" w:color="auto" w:val="clear"/>
         </w:rPr>
-        <w:t xml:space="preserve">[X]</w:t>
-      </w:r>
-      <w:r>
-        <w:rPr>
-          <w:rFonts w:ascii="Arial" w:cs="Arial" w:eastAsia="Arial" w:hAnsi="Arial"/>
-          <w:b/>
-          <w:bCs/>
-        </w:rPr>
-        <w:t xml:space="preserve"> business days</w:t>
-      </w:r>
-      <w:r>
-        <w:rPr>
-          <w:rFonts w:ascii="Arial" w:cs="Arial" w:eastAsia="Arial" w:hAnsi="Arial"/>
-        </w:rPr>
-        <w:t xml:space="preserve"> of receiving the goods and checking them. Afterpay refunds are processed through Afterpay and may take a few extra days to show in your account.</w:t>
+        <w:t xml:space="preserve">[CONFIRM]</w:t>
+      </w:r>
+      <w:r>
+        <w:rPr>
+          <w:rFonts w:ascii="Arial" w:cs="Arial" w:eastAsia="Arial" w:hAnsi="Arial"/>
+        </w:rPr>
+        <w:t xml:space="preserve">. Your bank or card provider may take extra time to show it. Afterpay refunds are processed through Afterpay.</w:t>
       </w:r>
     </w:p>
     <w:p>
@@ -380,7 +441,7 @@
         <w:rPr>
           <w:rFonts w:ascii="Arial" w:cs="Arial" w:eastAsia="Arial" w:hAnsi="Arial"/>
         </w:rPr>
-        <w:t xml:space="preserve">If you paid by bank transfer, PayID or cash at pickup, we will refund in the same way, in person or by bank transfer </w:t>
+        <w:t xml:space="preserve">If you paid by bank transfer, PayID or cash at pickup, we will refund in the same way </w:t>
       </w:r>
       <w:r>
         <w:rPr>
@@ -396,6 +457,22 @@
           <w:rFonts w:ascii="Arial" w:cs="Arial" w:eastAsia="Arial" w:hAnsi="Arial"/>
         </w:rPr>
         <w:t xml:space="preserve">.</w:t>
+      </w:r>
+    </w:p>
+    <w:p>
+      <w:pPr>
+        <w:pStyle w:val="ListParagraph"/>
+        <w:numPr>
+          <w:ilvl w:val="0"/>
+          <w:numId w:val="2"/>
+        </w:numPr>
+        <w:spacing w:after="100" w:line="300"/>
+      </w:pPr>
+      <w:r>
+        <w:rPr>
+          <w:rFonts w:ascii="Arial" w:cs="Arial" w:eastAsia="Arial" w:hAnsi="Arial"/>
+        </w:rPr>
+        <w:t xml:space="preserve">If you have not received an approved refund after 7 days, check with your bank first, then contact us.</w:t>
       </w:r>
     </w:p>
     <w:p>
@@ -423,7 +500,7 @@
         <w:rPr>
           <w:rFonts w:ascii="Arial" w:cs="Arial" w:eastAsia="Arial" w:hAnsi="Arial"/>
         </w:rPr>
-        <w:t xml:space="preserve">If you would like to exchange a product for a different size or style:</w:t>
+        <w:t xml:space="preserve">The quickest way to swap a product for a different size or style is to return the original under section 2 and place a new order. If you would rather we handle it as a straight exchange:</w:t>
       </w:r>
     </w:p>
     <w:p>
@@ -523,8 +600,54 @@
       <w:r>
         <w:rPr>
           <w:rFonts w:ascii="Arial" w:cs="Arial" w:eastAsia="Arial" w:hAnsi="Arial"/>
-        </w:rPr>
-        <w:t xml:space="preserve">Contact us as soon as possible by email at Edwin_10@live.com.au, on +61 431 533 520, or through our Contact Us page.</w:t>
+          <w:b/>
+          <w:bCs/>
+        </w:rPr>
+        <w:t xml:space="preserve">Contact us as soon as you can</w:t>
+      </w:r>
+      <w:r>
+        <w:rPr>
+          <w:rFonts w:ascii="Arial" w:cs="Arial" w:eastAsia="Arial" w:hAnsi="Arial"/>
+        </w:rPr>
+        <w:t xml:space="preserve"> - ideally within </w:t>
+      </w:r>
+      <w:r>
+        <w:rPr>
+          <w:rFonts w:ascii="Arial" w:cs="Arial" w:eastAsia="Arial" w:hAnsi="Arial"/>
+          <w:b/>
+          <w:bCs/>
+          <w:shd w:fill="FFF2B3" w:color="auto" w:val="clear"/>
+        </w:rPr>
+        <w:t xml:space="preserve">[7]</w:t>
+      </w:r>
+      <w:r>
+        <w:rPr>
+          <w:rFonts w:ascii="Arial" w:cs="Arial" w:eastAsia="Arial" w:hAnsi="Arial"/>
+          <w:b/>
+          <w:bCs/>
+        </w:rPr>
+        <w:t xml:space="preserve"> days</w:t>
+      </w:r>
+      <w:r>
+        <w:rPr>
+          <w:rFonts w:ascii="Arial" w:cs="Arial" w:eastAsia="Arial" w:hAnsi="Arial"/>
+        </w:rPr>
+        <w:t xml:space="preserve"> of receiving it </w:t>
+      </w:r>
+      <w:r>
+        <w:rPr>
+          <w:rFonts w:ascii="Arial" w:cs="Arial" w:eastAsia="Arial" w:hAnsi="Arial"/>
+          <w:b/>
+          <w:bCs/>
+          <w:shd w:fill="FFF2B3" w:color="auto" w:val="clear"/>
+        </w:rPr>
+        <w:t xml:space="preserve">[CONFIRM period]</w:t>
+      </w:r>
+      <w:r>
+        <w:rPr>
+          <w:rFonts w:ascii="Arial" w:cs="Arial" w:eastAsia="Arial" w:hAnsi="Arial"/>
+        </w:rPr>
+        <w:t xml:space="preserve"> - by email at Edwin_10@live.com.au, on +61 431 533 520, or through our Contact Us page. This is a request, not a deadline: it does not limit your rights under the Australian Consumer Law.</w:t>
       </w:r>
     </w:p>
     <w:p>
@@ -540,8 +663,50 @@
         <w:rPr>
           <w:rFonts w:ascii="Arial" w:cs="Arial" w:eastAsia="Arial" w:hAnsi="Arial"/>
         </w:rPr>
-        <w:t xml:space="preserve">Include your order number, a description of the problem, and </w:t>
-      </w:r>
+        <w:t xml:space="preserve">Please include:</w:t>
+      </w:r>
+    </w:p>
+    <w:p>
+      <w:pPr>
+        <w:pStyle w:val="ListParagraph"/>
+        <w:numPr>
+          <w:ilvl w:val="1"/>
+          <w:numId w:val="2"/>
+        </w:numPr>
+        <w:spacing w:after="80" w:line="300"/>
+      </w:pPr>
+      <w:r>
+        <w:rPr>
+          <w:rFonts w:ascii="Arial" w:cs="Arial" w:eastAsia="Arial" w:hAnsi="Arial"/>
+        </w:rPr>
+        <w:t xml:space="preserve">your order number</w:t>
+      </w:r>
+    </w:p>
+    <w:p>
+      <w:pPr>
+        <w:pStyle w:val="ListParagraph"/>
+        <w:numPr>
+          <w:ilvl w:val="1"/>
+          <w:numId w:val="2"/>
+        </w:numPr>
+        <w:spacing w:after="80" w:line="300"/>
+      </w:pPr>
+      <w:r>
+        <w:rPr>
+          <w:rFonts w:ascii="Arial" w:cs="Arial" w:eastAsia="Arial" w:hAnsi="Arial"/>
+        </w:rPr>
+        <w:t xml:space="preserve">a description of the problem</w:t>
+      </w:r>
+    </w:p>
+    <w:p>
+      <w:pPr>
+        <w:pStyle w:val="ListParagraph"/>
+        <w:numPr>
+          <w:ilvl w:val="1"/>
+          <w:numId w:val="2"/>
+        </w:numPr>
+        <w:spacing w:after="80" w:line="300"/>
+      </w:pPr>
       <w:r>
         <w:rPr>
           <w:rFonts w:ascii="Arial" w:cs="Arial" w:eastAsia="Arial" w:hAnsi="Arial"/>
@@ -554,7 +719,7 @@
         <w:rPr>
           <w:rFonts w:ascii="Arial" w:cs="Arial" w:eastAsia="Arial" w:hAnsi="Arial"/>
         </w:rPr>
-        <w:t xml:space="preserve"> of the damage or fault. Photos of the outside of the boxes help if the damage happened in transit.</w:t>
+        <w:t xml:space="preserve"> of the whole product, the damaged or faulty area, the outer packaging and the shipping label</w:t>
       </w:r>
     </w:p>
     <w:p>
@@ -569,6 +734,46 @@
       <w:r>
         <w:rPr>
           <w:rFonts w:ascii="Arial" w:cs="Arial" w:eastAsia="Arial" w:hAnsi="Arial"/>
+          <w:b/>
+          <w:bCs/>
+        </w:rPr>
+        <w:t xml:space="preserve">Keep the packaging</w:t>
+      </w:r>
+      <w:r>
+        <w:rPr>
+          <w:rFonts w:ascii="Arial" w:cs="Arial" w:eastAsia="Arial" w:hAnsi="Arial"/>
+        </w:rPr>
+        <w:t xml:space="preserve"> until the matter is sorted out, and do not dispose of the product.</w:t>
+      </w:r>
+    </w:p>
+    <w:p>
+      <w:pPr>
+        <w:pStyle w:val="ListParagraph"/>
+        <w:numPr>
+          <w:ilvl w:val="0"/>
+          <w:numId w:val="3"/>
+        </w:numPr>
+        <w:spacing w:after="100" w:line="300"/>
+      </w:pPr>
+      <w:r>
+        <w:rPr>
+          <w:rFonts w:ascii="Arial" w:cs="Arial" w:eastAsia="Arial" w:hAnsi="Arial"/>
+        </w:rPr>
+        <w:t xml:space="preserve">We may ask you to send the product back, or arrange to inspect it, before approving a remedy.</w:t>
+      </w:r>
+    </w:p>
+    <w:p>
+      <w:pPr>
+        <w:pStyle w:val="ListParagraph"/>
+        <w:numPr>
+          <w:ilvl w:val="0"/>
+          <w:numId w:val="3"/>
+        </w:numPr>
+        <w:spacing w:after="100" w:line="300"/>
+      </w:pPr>
+      <w:r>
+        <w:rPr>
+          <w:rFonts w:ascii="Arial" w:cs="Arial" w:eastAsia="Arial" w:hAnsi="Arial"/>
         </w:rPr>
         <w:t xml:space="preserve">We will arrange a repair, replacement or refund, depending on what you are entitled to under the Australian Consumer Law.</w:t>
       </w:r>
@@ -580,8 +785,67 @@
       <w:r>
         <w:rPr>
           <w:rFonts w:ascii="Arial" w:cs="Arial" w:eastAsia="Arial" w:hAnsi="Arial"/>
-        </w:rPr>
-        <w:t xml:space="preserve">We cover the cost of returning goods that are faulty, damaged or not as described. Our Warranty Policy gives you extra cover for the first 12 months.</w:t>
+          <w:b/>
+          <w:bCs/>
+        </w:rPr>
+        <w:t xml:space="preserve">Unboxing video:</w:t>
+      </w:r>
+      <w:r>
+        <w:rPr>
+          <w:rFonts w:ascii="Arial" w:cs="Arial" w:eastAsia="Arial" w:hAnsi="Arial"/>
+        </w:rPr>
+        <w:t xml:space="preserve"> for large or freight-delivered orders, we recommend filming yourself opening the packaging so that the sealed boxes, the shipping label and the contents are clear. It is not required, and not having one does not affect your rights, but it helps us resolve any damage claim faster.</w:t>
+      </w:r>
+    </w:p>
+    <w:p>
+      <w:pPr>
+        <w:spacing w:after="160" w:line="300"/>
+      </w:pPr>
+      <w:r>
+        <w:rPr>
+          <w:rFonts w:ascii="Arial" w:cs="Arial" w:eastAsia="Arial" w:hAnsi="Arial"/>
+        </w:rPr>
+        <w:t xml:space="preserve">We cover the cost of returning goods that are faulty, damaged or not as described. If, after inspection, a product turns out not to be faulty, we may ask you to cover reasonable inspection and return costs </w:t>
+      </w:r>
+      <w:r>
+        <w:rPr>
+          <w:rFonts w:ascii="Arial" w:cs="Arial" w:eastAsia="Arial" w:hAnsi="Arial"/>
+          <w:b/>
+          <w:bCs/>
+          <w:shd w:fill="FFF2B3" w:color="auto" w:val="clear"/>
+        </w:rPr>
+        <w:t xml:space="preserve">[CONFIRM: to the extent the law allows]</w:t>
+      </w:r>
+      <w:r>
+        <w:rPr>
+          <w:rFonts w:ascii="Arial" w:cs="Arial" w:eastAsia="Arial" w:hAnsi="Arial"/>
+        </w:rPr>
+        <w:t xml:space="preserve">.</w:t>
+      </w:r>
+    </w:p>
+    <w:p>
+      <w:pPr>
+        <w:spacing w:after="160" w:line="300"/>
+      </w:pPr>
+      <w:r>
+        <w:rPr>
+          <w:rFonts w:ascii="Arial" w:cs="Arial" w:eastAsia="Arial" w:hAnsi="Arial"/>
+        </w:rPr>
+        <w:t xml:space="preserve">Our </w:t>
+      </w:r>
+      <w:r>
+        <w:rPr>
+          <w:rFonts w:ascii="Arial" w:cs="Arial" w:eastAsia="Arial" w:hAnsi="Arial"/>
+          <w:b/>
+          <w:bCs/>
+        </w:rPr>
+        <w:t xml:space="preserve">Warranty Policy</w:t>
+      </w:r>
+      <w:r>
+        <w:rPr>
+          <w:rFonts w:ascii="Arial" w:cs="Arial" w:eastAsia="Arial" w:hAnsi="Arial"/>
+        </w:rPr>
+        <w:t xml:space="preserve"> gives you extra cover for the first 12 months.</w:t>
       </w:r>
     </w:p>
     <w:p>
@@ -598,7 +862,7 @@
           <w:sz w:val="26"/>
           <w:szCs w:val="26"/>
         </w:rPr>
-        <w:t xml:space="preserve">5. Things we cannot accept for return</w:t>
+        <w:t xml:space="preserve">5. Cancelling an order</w:t>
       </w:r>
     </w:p>
     <w:p>
@@ -609,7 +873,7 @@
         <w:rPr>
           <w:rFonts w:ascii="Arial" w:cs="Arial" w:eastAsia="Arial" w:hAnsi="Arial"/>
         </w:rPr>
-        <w:t xml:space="preserve">We cannot accept change-of-mind returns for:</w:t>
+        <w:t xml:space="preserve">If you want to change or cancel an order, please contact us as soon as you can.</w:t>
       </w:r>
     </w:p>
     <w:p>
@@ -624,8 +888,39 @@
       <w:r>
         <w:rPr>
           <w:rFonts w:ascii="Arial" w:cs="Arial" w:eastAsia="Arial" w:hAnsi="Arial"/>
-        </w:rPr>
-        <w:t xml:space="preserve">products that are damaged, worn or modified after delivery or collection</w:t>
+          <w:b/>
+          <w:bCs/>
+        </w:rPr>
+        <w:t xml:space="preserve">Before we dispatch it,</w:t>
+      </w:r>
+      <w:r>
+        <w:rPr>
+          <w:rFonts w:ascii="Arial" w:cs="Arial" w:eastAsia="Arial" w:hAnsi="Arial"/>
+        </w:rPr>
+        <w:t xml:space="preserve"> we can usually cancel it and refund you in full </w:t>
+      </w:r>
+      <w:r>
+        <w:rPr>
+          <w:rFonts w:ascii="Arial" w:cs="Arial" w:eastAsia="Arial" w:hAnsi="Arial"/>
+          <w:b/>
+          <w:bCs/>
+          <w:shd w:fill="FFF2B3" w:color="auto" w:val="clear"/>
+        </w:rPr>
+        <w:t xml:space="preserve">[CONFIRM: or deduct payment processing fees of about [X]</w:t>
+      </w:r>
+      <w:r>
+        <w:rPr>
+          <w:rFonts w:ascii="Arial" w:cs="Arial" w:eastAsia="Arial" w:hAnsi="Arial"/>
+          <w:b/>
+          <w:bCs/>
+        </w:rPr>
+        <w:t xml:space="preserve">%]</w:t>
+      </w:r>
+      <w:r>
+        <w:rPr>
+          <w:rFonts w:ascii="Arial" w:cs="Arial" w:eastAsia="Arial" w:hAnsi="Arial"/>
+        </w:rPr>
+        <w:t xml:space="preserve">.</w:t>
       </w:r>
     </w:p>
     <w:p>
@@ -640,47 +935,16 @@
       <w:r>
         <w:rPr>
           <w:rFonts w:ascii="Arial" w:cs="Arial" w:eastAsia="Arial" w:hAnsi="Arial"/>
-        </w:rPr>
-        <w:t xml:space="preserve">products that have been assembled and used </w:t>
-      </w:r>
-      <w:r>
-        <w:rPr>
-          <w:rFonts w:ascii="Arial" w:cs="Arial" w:eastAsia="Arial" w:hAnsi="Arial"/>
-          <w:b/>
-          <w:bCs/>
-          <w:shd w:fill="FFF2B3" w:color="auto" w:val="clear"/>
-        </w:rPr>
-        <w:t xml:space="preserve">[CONFIRM]</w:t>
-      </w:r>
-    </w:p>
-    <w:p>
-      <w:pPr>
-        <w:pStyle w:val="ListParagraph"/>
-        <w:numPr>
-          <w:ilvl w:val="0"/>
-          <w:numId w:val="2"/>
-        </w:numPr>
-        <w:spacing w:after="100" w:line="300"/>
-      </w:pPr>
-      <w:r>
-        <w:rPr>
-          <w:rFonts w:ascii="Arial" w:cs="Arial" w:eastAsia="Arial" w:hAnsi="Arial"/>
-          <w:b/>
-          <w:bCs/>
-          <w:shd w:fill="FFF2B3" w:color="auto" w:val="clear"/>
-        </w:rPr>
-        <w:t xml:space="preserve">[any custom, special-order or clearance items you want to exclude]</w:t>
-      </w:r>
-    </w:p>
-    <w:p>
-      <w:pPr>
-        <w:spacing w:after="160" w:line="300"/>
-      </w:pPr>
-      <w:r>
-        <w:rPr>
-          <w:rFonts w:ascii="Arial" w:cs="Arial" w:eastAsia="Arial" w:hAnsi="Arial"/>
-        </w:rPr>
-        <w:t xml:space="preserve">This does not affect your rights if a product is faulty (section 4).</w:t>
+          <w:b/>
+          <w:bCs/>
+        </w:rPr>
+        <w:t xml:space="preserve">After it has been dispatched or collected,</w:t>
+      </w:r>
+      <w:r>
+        <w:rPr>
+          <w:rFonts w:ascii="Arial" w:cs="Arial" w:eastAsia="Arial" w:hAnsi="Arial"/>
+        </w:rPr>
+        <w:t xml:space="preserve"> it can no longer be cancelled. You can return it under section 2.</w:t>
       </w:r>
     </w:p>
     <w:p>
@@ -697,47 +961,58 @@
           <w:sz w:val="26"/>
           <w:szCs w:val="26"/>
         </w:rPr>
-        <w:t xml:space="preserve">6. How to start a return</w:t>
-      </w:r>
-    </w:p>
-    <w:p>
-      <w:pPr>
-        <w:pStyle w:val="ListParagraph"/>
-        <w:numPr>
-          <w:ilvl w:val="0"/>
-          <w:numId w:val="4"/>
-        </w:numPr>
-        <w:spacing w:after="100" w:line="300"/>
-      </w:pPr>
-      <w:r>
-        <w:rPr>
-          <w:rFonts w:ascii="Arial" w:cs="Arial" w:eastAsia="Arial" w:hAnsi="Arial"/>
-          <w:b/>
-          <w:bCs/>
-        </w:rPr>
-        <w:t xml:space="preserve">Contact us</w:t>
-      </w:r>
-      <w:r>
-        <w:rPr>
-          <w:rFonts w:ascii="Arial" w:cs="Arial" w:eastAsia="Arial" w:hAnsi="Arial"/>
-        </w:rPr>
-        <w:t xml:space="preserve"> through the Contact Us page, or by email at Edwin_10@live.com.au, with your order number and the reason for the return.</w:t>
-      </w:r>
-    </w:p>
-    <w:p>
-      <w:pPr>
-        <w:pStyle w:val="ListParagraph"/>
-        <w:numPr>
-          <w:ilvl w:val="0"/>
-          <w:numId w:val="4"/>
-        </w:numPr>
-        <w:spacing w:after="100" w:line="300"/>
-      </w:pPr>
-      <w:r>
-        <w:rPr>
-          <w:rFonts w:ascii="Arial" w:cs="Arial" w:eastAsia="Arial" w:hAnsi="Arial"/>
-        </w:rPr>
-        <w:t xml:space="preserve">We will reply with the return instructions, including the address to send goods back to </w:t>
+        <w:t xml:space="preserve">6. Things we cannot accept for return</w:t>
+      </w:r>
+    </w:p>
+    <w:p>
+      <w:pPr>
+        <w:spacing w:after="160" w:line="300"/>
+      </w:pPr>
+      <w:r>
+        <w:rPr>
+          <w:rFonts w:ascii="Arial" w:cs="Arial" w:eastAsia="Arial" w:hAnsi="Arial"/>
+        </w:rPr>
+        <w:t xml:space="preserve">We cannot accept change-of-mind returns for:</w:t>
+      </w:r>
+    </w:p>
+    <w:p>
+      <w:pPr>
+        <w:pStyle w:val="ListParagraph"/>
+        <w:numPr>
+          <w:ilvl w:val="0"/>
+          <w:numId w:val="2"/>
+        </w:numPr>
+        <w:spacing w:after="100" w:line="300"/>
+      </w:pPr>
+      <w:r>
+        <w:rPr>
+          <w:rFonts w:ascii="Arial" w:cs="Arial" w:eastAsia="Arial" w:hAnsi="Arial"/>
+        </w:rPr>
+        <w:t xml:space="preserve">products that are damaged, used, assembled or modified after delivery or collection</w:t>
+      </w:r>
+    </w:p>
+    <w:p>
+      <w:pPr>
+        <w:pStyle w:val="ListParagraph"/>
+        <w:numPr>
+          <w:ilvl w:val="0"/>
+          <w:numId w:val="2"/>
+        </w:numPr>
+        <w:spacing w:after="100" w:line="300"/>
+      </w:pPr>
+      <w:r>
+        <w:rPr>
+          <w:rFonts w:ascii="Arial" w:cs="Arial" w:eastAsia="Arial" w:hAnsi="Arial"/>
+          <w:b/>
+          <w:bCs/>
+        </w:rPr>
+        <w:t xml:space="preserve">sale or clearance items</w:t>
+      </w:r>
+      <w:r>
+        <w:rPr>
+          <w:rFonts w:ascii="Arial" w:cs="Arial" w:eastAsia="Arial" w:hAnsi="Arial"/>
+        </w:rPr>
+        <w:t xml:space="preserve"> </w:t>
       </w:r>
       <w:r>
         <w:rPr>
@@ -746,67 +1021,84 @@
           <w:bCs/>
           <w:shd w:fill="FFF2B3" w:color="auto" w:val="clear"/>
         </w:rPr>
-        <w:t xml:space="preserve">[CONFIRM: Moonee Ponds warehouse, 4 Ardmillan Road, Moonee Ponds VIC 3039]</w:t>
-      </w:r>
-      <w:r>
-        <w:rPr>
-          <w:rFonts w:ascii="Arial" w:cs="Arial" w:eastAsia="Arial" w:hAnsi="Arial"/>
-        </w:rPr>
-        <w:t xml:space="preserve">.</w:t>
-      </w:r>
-    </w:p>
-    <w:p>
-      <w:pPr>
-        <w:pStyle w:val="ListParagraph"/>
-        <w:numPr>
-          <w:ilvl w:val="0"/>
-          <w:numId w:val="4"/>
-        </w:numPr>
-        <w:spacing w:after="100" w:line="300"/>
-      </w:pPr>
-      <w:r>
-        <w:rPr>
-          <w:rFonts w:ascii="Arial" w:cs="Arial" w:eastAsia="Arial" w:hAnsi="Arial"/>
-          <w:b/>
-          <w:bCs/>
-        </w:rPr>
-        <w:t xml:space="preserve">Pack the goods securely.</w:t>
-      </w:r>
-      <w:r>
-        <w:rPr>
-          <w:rFonts w:ascii="Arial" w:cs="Arial" w:eastAsia="Arial" w:hAnsi="Arial"/>
-        </w:rPr>
-        <w:t xml:space="preserve"> Shelving is heavy and sharp-edged, so please wrap it so it cannot be damaged or hurt anyone in transit.</w:t>
-      </w:r>
-    </w:p>
-    <w:p>
-      <w:pPr>
-        <w:pStyle w:val="ListParagraph"/>
-        <w:numPr>
-          <w:ilvl w:val="0"/>
-          <w:numId w:val="4"/>
-        </w:numPr>
-        <w:spacing w:after="100" w:line="300"/>
-      </w:pPr>
-      <w:r>
-        <w:rPr>
-          <w:rFonts w:ascii="Arial" w:cs="Arial" w:eastAsia="Arial" w:hAnsi="Arial"/>
-        </w:rPr>
-        <w:t xml:space="preserve">Send it by a </w:t>
-      </w:r>
-      <w:r>
-        <w:rPr>
-          <w:rFonts w:ascii="Arial" w:cs="Arial" w:eastAsia="Arial" w:hAnsi="Arial"/>
-          <w:b/>
-          <w:bCs/>
-        </w:rPr>
-        <w:t xml:space="preserve">tracked method</w:t>
-      </w:r>
-      <w:r>
-        <w:rPr>
-          <w:rFonts w:ascii="Arial" w:cs="Arial" w:eastAsia="Arial" w:hAnsi="Arial"/>
-        </w:rPr>
-        <w:t xml:space="preserve"> and keep your tracking details. We are not responsible for goods lost in transit on their way back to us.</w:t>
+        <w:t xml:space="preserve">[CONFIRM if you run any]</w:t>
+      </w:r>
+    </w:p>
+    <w:p>
+      <w:pPr>
+        <w:pStyle w:val="ListParagraph"/>
+        <w:numPr>
+          <w:ilvl w:val="0"/>
+          <w:numId w:val="2"/>
+        </w:numPr>
+        <w:spacing w:after="100" w:line="300"/>
+      </w:pPr>
+      <w:r>
+        <w:rPr>
+          <w:rFonts w:ascii="Arial" w:cs="Arial" w:eastAsia="Arial" w:hAnsi="Arial"/>
+          <w:b/>
+          <w:bCs/>
+        </w:rPr>
+        <w:t xml:space="preserve">custom or special-order items</w:t>
+      </w:r>
+      <w:r>
+        <w:rPr>
+          <w:rFonts w:ascii="Arial" w:cs="Arial" w:eastAsia="Arial" w:hAnsi="Arial"/>
+        </w:rPr>
+        <w:t xml:space="preserve"> </w:t>
+      </w:r>
+      <w:r>
+        <w:rPr>
+          <w:rFonts w:ascii="Arial" w:cs="Arial" w:eastAsia="Arial" w:hAnsi="Arial"/>
+          <w:b/>
+          <w:bCs/>
+          <w:shd w:fill="FFF2B3" w:color="auto" w:val="clear"/>
+        </w:rPr>
+        <w:t xml:space="preserve">[CONFIRM if you offer any]</w:t>
+      </w:r>
+    </w:p>
+    <w:p>
+      <w:pPr>
+        <w:pStyle w:val="ListParagraph"/>
+        <w:numPr>
+          <w:ilvl w:val="0"/>
+          <w:numId w:val="2"/>
+        </w:numPr>
+        <w:spacing w:after="100" w:line="300"/>
+      </w:pPr>
+      <w:r>
+        <w:rPr>
+          <w:rFonts w:ascii="Arial" w:cs="Arial" w:eastAsia="Arial" w:hAnsi="Arial"/>
+          <w:b/>
+          <w:bCs/>
+        </w:rPr>
+        <w:t xml:space="preserve">gift cards</w:t>
+      </w:r>
+      <w:r>
+        <w:rPr>
+          <w:rFonts w:ascii="Arial" w:cs="Arial" w:eastAsia="Arial" w:hAnsi="Arial"/>
+        </w:rPr>
+        <w:t xml:space="preserve"> </w:t>
+      </w:r>
+      <w:r>
+        <w:rPr>
+          <w:rFonts w:ascii="Arial" w:cs="Arial" w:eastAsia="Arial" w:hAnsi="Arial"/>
+          <w:b/>
+          <w:bCs/>
+          <w:shd w:fill="FFF2B3" w:color="auto" w:val="clear"/>
+        </w:rPr>
+        <w:t xml:space="preserve">[CONFIRM if you sell any]</w:t>
+      </w:r>
+    </w:p>
+    <w:p>
+      <w:pPr>
+        <w:spacing w:after="160" w:line="300"/>
+      </w:pPr>
+      <w:r>
+        <w:rPr>
+          <w:rFonts w:ascii="Arial" w:cs="Arial" w:eastAsia="Arial" w:hAnsi="Arial"/>
+        </w:rPr>
+        <w:t xml:space="preserve">This does not affect your rights if a product is faulty (section 4).</w:t>
       </w:r>
     </w:p>
     <w:p>
@@ -823,7 +1115,163 @@
           <w:sz w:val="26"/>
           <w:szCs w:val="26"/>
         </w:rPr>
-        <w:t xml:space="preserve">7. Contact us</w:t>
+        <w:t xml:space="preserve">7. How to start a return</w:t>
+      </w:r>
+    </w:p>
+    <w:p>
+      <w:pPr>
+        <w:pStyle w:val="ListParagraph"/>
+        <w:numPr>
+          <w:ilvl w:val="0"/>
+          <w:numId w:val="4"/>
+        </w:numPr>
+        <w:spacing w:after="100" w:line="300"/>
+      </w:pPr>
+      <w:r>
+        <w:rPr>
+          <w:rFonts w:ascii="Arial" w:cs="Arial" w:eastAsia="Arial" w:hAnsi="Arial"/>
+          <w:b/>
+          <w:bCs/>
+        </w:rPr>
+        <w:t xml:space="preserve">Contact us</w:t>
+      </w:r>
+      <w:r>
+        <w:rPr>
+          <w:rFonts w:ascii="Arial" w:cs="Arial" w:eastAsia="Arial" w:hAnsi="Arial"/>
+        </w:rPr>
+        <w:t xml:space="preserve"> through the Contact Us page or by email at Edwin_10@live.com.au with your order number and the reason for the return. Please do not send anything back before we reply.</w:t>
+      </w:r>
+    </w:p>
+    <w:p>
+      <w:pPr>
+        <w:pStyle w:val="ListParagraph"/>
+        <w:numPr>
+          <w:ilvl w:val="0"/>
+          <w:numId w:val="4"/>
+        </w:numPr>
+        <w:spacing w:after="100" w:line="300"/>
+      </w:pPr>
+      <w:r>
+        <w:rPr>
+          <w:rFonts w:ascii="Arial" w:cs="Arial" w:eastAsia="Arial" w:hAnsi="Arial"/>
+        </w:rPr>
+        <w:t xml:space="preserve">We will reply with the </w:t>
+      </w:r>
+      <w:r>
+        <w:rPr>
+          <w:rFonts w:ascii="Arial" w:cs="Arial" w:eastAsia="Arial" w:hAnsi="Arial"/>
+          <w:b/>
+          <w:bCs/>
+        </w:rPr>
+        <w:t xml:space="preserve">return instructions</w:t>
+      </w:r>
+      <w:r>
+        <w:rPr>
+          <w:rFonts w:ascii="Arial" w:cs="Arial" w:eastAsia="Arial" w:hAnsi="Arial"/>
+        </w:rPr>
+        <w:t xml:space="preserve">, including the address to send goods to </w:t>
+      </w:r>
+      <w:r>
+        <w:rPr>
+          <w:rFonts w:ascii="Arial" w:cs="Arial" w:eastAsia="Arial" w:hAnsi="Arial"/>
+          <w:b/>
+          <w:bCs/>
+          <w:shd w:fill="FFF2B3" w:color="auto" w:val="clear"/>
+        </w:rPr>
+        <w:t xml:space="preserve">[CONFIRM: Moonee Ponds warehouse, 4 Ardmillan Road, Moonee Ponds VIC 3039]</w:t>
+      </w:r>
+      <w:r>
+        <w:rPr>
+          <w:rFonts w:ascii="Arial" w:cs="Arial" w:eastAsia="Arial" w:hAnsi="Arial"/>
+        </w:rPr>
+        <w:t xml:space="preserve">.</w:t>
+      </w:r>
+    </w:p>
+    <w:p>
+      <w:pPr>
+        <w:pStyle w:val="ListParagraph"/>
+        <w:numPr>
+          <w:ilvl w:val="0"/>
+          <w:numId w:val="4"/>
+        </w:numPr>
+        <w:spacing w:after="100" w:line="300"/>
+      </w:pPr>
+      <w:r>
+        <w:rPr>
+          <w:rFonts w:ascii="Arial" w:cs="Arial" w:eastAsia="Arial" w:hAnsi="Arial"/>
+          <w:b/>
+          <w:bCs/>
+        </w:rPr>
+        <w:t xml:space="preserve">Pack the goods securely in their original packaging.</w:t>
+      </w:r>
+      <w:r>
+        <w:rPr>
+          <w:rFonts w:ascii="Arial" w:cs="Arial" w:eastAsia="Arial" w:hAnsi="Arial"/>
+        </w:rPr>
+        <w:t xml:space="preserve"> Shelving is heavy and sharp-edged, so wrap it so it cannot be damaged or hurt anyone in transit.</w:t>
+      </w:r>
+    </w:p>
+    <w:p>
+      <w:pPr>
+        <w:pStyle w:val="ListParagraph"/>
+        <w:numPr>
+          <w:ilvl w:val="0"/>
+          <w:numId w:val="4"/>
+        </w:numPr>
+        <w:spacing w:after="100" w:line="300"/>
+      </w:pPr>
+      <w:r>
+        <w:rPr>
+          <w:rFonts w:ascii="Arial" w:cs="Arial" w:eastAsia="Arial" w:hAnsi="Arial"/>
+        </w:rPr>
+        <w:t xml:space="preserve">Send it by a </w:t>
+      </w:r>
+      <w:r>
+        <w:rPr>
+          <w:rFonts w:ascii="Arial" w:cs="Arial" w:eastAsia="Arial" w:hAnsi="Arial"/>
+          <w:b/>
+          <w:bCs/>
+        </w:rPr>
+        <w:t xml:space="preserve">tracked method</w:t>
+      </w:r>
+      <w:r>
+        <w:rPr>
+          <w:rFonts w:ascii="Arial" w:cs="Arial" w:eastAsia="Arial" w:hAnsi="Arial"/>
+        </w:rPr>
+        <w:t xml:space="preserve"> and keep your tracking details. We cannot be responsible for goods lost on their way back to us.</w:t>
+      </w:r>
+    </w:p>
+    <w:p>
+      <w:pPr>
+        <w:pStyle w:val="ListParagraph"/>
+        <w:numPr>
+          <w:ilvl w:val="0"/>
+          <w:numId w:val="4"/>
+        </w:numPr>
+        <w:spacing w:after="100" w:line="300"/>
+      </w:pPr>
+      <w:r>
+        <w:rPr>
+          <w:rFonts w:ascii="Arial" w:cs="Arial" w:eastAsia="Arial" w:hAnsi="Arial"/>
+        </w:rPr>
+        <w:t xml:space="preserve">Include a copy of your order confirmation or receipt.</w:t>
+      </w:r>
+    </w:p>
+    <w:p>
+      <w:pPr>
+        <w:pStyle w:val="Heading2"/>
+        <w:keepNext/>
+        <w:spacing w:after="120" w:before="280"/>
+      </w:pPr>
+      <w:r>
+        <w:rPr>
+          <w:rFonts w:ascii="Arial" w:cs="Arial" w:eastAsia="Arial" w:hAnsi="Arial"/>
+          <w:b/>
+          <w:bCs/>
+          <w:sz w:val="26"/>
+          <w:szCs w:val="26"/>
+        </w:rPr>
+        <w:t xml:space="preserve">8. Contact us</w:t>
       </w:r>
     </w:p>
     <w:p>
@@ -1084,6 +1532,15 @@
       <w:lvlJc w:val="left"/>
       <w:pPr>
         <w:ind w:left="720" w:hanging="360"/>
+      </w:pPr>
+    </w:lvl>
+    <w:lvl w:ilvl="1" w:tentative="1">
+      <w:start w:val="1"/>
+      <w:numFmt w:val="bullet"/>
+      <w:lvlText w:val="–"/>
+      <w:lvlJc w:val="left"/>
+      <w:pPr>
+        <w:ind w:left="1260" w:hanging="360"/>
       </w:pPr>
     </w:lvl>
   </w:abstractNum>

</xml_diff>

<commit_message>
Returns policy v3 and Terms v5: restocking fee, unopened boxes, 7-day refund, cancellation fee
Co-Authored-By: Claude Sonnet 5.5 <noreply@anthropic.com>
</commit_message>
<xml_diff>
--- a/docs/policy-drafts/returns-policy.docx
+++ b/docs/policy-drafts/returns-policy.docx
@@ -35,7 +35,7 @@
           <w:sz w:val="20"/>
           <w:szCs w:val="20"/>
         </w:rPr>
-        <w:t xml:space="preserve">Draft for review (version 2).</w:t>
+        <w:t xml:space="preserve">Draft for review (version 3).</w:t>
       </w:r>
       <w:r>
         <w:rPr>
@@ -43,7 +43,7 @@
           <w:sz w:val="20"/>
           <w:szCs w:val="20"/>
         </w:rPr>
-        <w:t xml:space="preserve"> Written from the returns information on the Super Shelving FAQs page and in our Terms of Service, and updated after comparing five Australian shelving retailers' returns policies. Anything in </w:t>
+        <w:t xml:space="preserve"> Written from the returns information on the Super Shelving FAQs page and in our Terms of Service, updated after comparing five Australian shelving retailers' returns policies and with your answers on restocking fees, refund times and cancellations. Anything in </w:t>
       </w:r>
       <w:r>
         <w:rPr>
@@ -62,7 +62,7 @@
           <w:sz w:val="20"/>
           <w:szCs w:val="20"/>
         </w:rPr>
-        <w:t xml:space="preserve"> is a placeholder or an assumption to confirm. Not legal advice - have it checked before publishing, especially sections 1, 4 and 6.</w:t>
+        <w:t xml:space="preserve"> is a placeholder or an assumption to confirm. Not legal advice - have it checked before publishing, especially sections 1, 2, 4 and 5.</w:t>
       </w:r>
     </w:p>
     <w:p>
@@ -128,7 +128,7 @@
         <w:rPr>
           <w:rFonts w:ascii="Arial" w:cs="Arial" w:eastAsia="Arial" w:hAnsi="Arial"/>
         </w:rPr>
-        <w:t xml:space="preserve">Nothing in this policy limits those rights. Any time limits, packaging rules or conditions in this policy do not apply to your rights if a product is faulty.</w:t>
+        <w:t xml:space="preserve">Nothing in this policy limits those rights. Any time limits, packaging rules, fees or conditions in this policy do not apply to your rights if a product is faulty.</w:t>
       </w:r>
     </w:p>
     <w:p>
@@ -194,13 +194,161 @@
           <w:b/>
           <w:bCs/>
         </w:rPr>
-        <w:t xml:space="preserve">unused, unassembled and in its original packaging</w:t>
-      </w:r>
-      <w:r>
-        <w:rPr>
-          <w:rFonts w:ascii="Arial" w:cs="Arial" w:eastAsia="Arial" w:hAnsi="Arial"/>
-        </w:rPr>
-        <w:t xml:space="preserve">, with all parts, fittings and manuals </w:t>
+        <w:t xml:space="preserve">unassembled, unused and in its original, unopened boxes</w:t>
+      </w:r>
+      <w:r>
+        <w:rPr>
+          <w:rFonts w:ascii="Arial" w:cs="Arial" w:eastAsia="Arial" w:hAnsi="Arial"/>
+        </w:rPr>
+        <w:t xml:space="preserve">, with nothing removed</w:t>
+      </w:r>
+    </w:p>
+    <w:p>
+      <w:pPr>
+        <w:pStyle w:val="ListParagraph"/>
+        <w:numPr>
+          <w:ilvl w:val="0"/>
+          <w:numId w:val="2"/>
+        </w:numPr>
+        <w:spacing w:after="100" w:line="300"/>
+      </w:pPr>
+      <w:r>
+        <w:rPr>
+          <w:rFonts w:ascii="Arial" w:cs="Arial" w:eastAsia="Arial" w:hAnsi="Arial"/>
+        </w:rPr>
+        <w:t xml:space="preserve">you contact us within the 14 days and </w:t>
+      </w:r>
+      <w:r>
+        <w:rPr>
+          <w:rFonts w:ascii="Arial" w:cs="Arial" w:eastAsia="Arial" w:hAnsi="Arial"/>
+          <w:b/>
+          <w:bCs/>
+        </w:rPr>
+        <w:t xml:space="preserve">wait for our return instructions before sending anything back</w:t>
+      </w:r>
+    </w:p>
+    <w:p>
+      <w:pPr>
+        <w:pStyle w:val="ListParagraph"/>
+        <w:numPr>
+          <w:ilvl w:val="0"/>
+          <w:numId w:val="2"/>
+        </w:numPr>
+        <w:spacing w:after="100" w:line="300"/>
+      </w:pPr>
+      <w:r>
+        <w:rPr>
+          <w:rFonts w:ascii="Arial" w:cs="Arial" w:eastAsia="Arial" w:hAnsi="Arial"/>
+        </w:rPr>
+        <w:t xml:space="preserve">you have your order number or proof of purchase</w:t>
+      </w:r>
+    </w:p>
+    <w:p>
+      <w:pPr>
+        <w:spacing w:after="160" w:line="300"/>
+      </w:pPr>
+      <w:r>
+        <w:rPr>
+          <w:rFonts w:ascii="Arial" w:cs="Arial" w:eastAsia="Arial" w:hAnsi="Arial"/>
+        </w:rPr>
+        <w:t xml:space="preserve">Products that have been opened, assembled, used, damaged or modified do not qualify for a change-of-mind return.</w:t>
+      </w:r>
+    </w:p>
+    <w:p>
+      <w:pPr>
+        <w:spacing w:after="160" w:line="300"/>
+      </w:pPr>
+      <w:r>
+        <w:rPr>
+          <w:rFonts w:ascii="Arial" w:cs="Arial" w:eastAsia="Arial" w:hAnsi="Arial"/>
+          <w:b/>
+          <w:bCs/>
+        </w:rPr>
+        <w:t xml:space="preserve">How the refund works</w:t>
+      </w:r>
+    </w:p>
+    <w:p>
+      <w:pPr>
+        <w:pStyle w:val="ListParagraph"/>
+        <w:numPr>
+          <w:ilvl w:val="0"/>
+          <w:numId w:val="2"/>
+        </w:numPr>
+        <w:spacing w:after="100" w:line="300"/>
+      </w:pPr>
+      <w:r>
+        <w:rPr>
+          <w:rFonts w:ascii="Arial" w:cs="Arial" w:eastAsia="Arial" w:hAnsi="Arial"/>
+        </w:rPr>
+        <w:t xml:space="preserve">You </w:t>
+      </w:r>
+      <w:r>
+        <w:rPr>
+          <w:rFonts w:ascii="Arial" w:cs="Arial" w:eastAsia="Arial" w:hAnsi="Arial"/>
+          <w:b/>
+          <w:bCs/>
+        </w:rPr>
+        <w:t xml:space="preserve">pay the freight</w:t>
+      </w:r>
+      <w:r>
+        <w:rPr>
+          <w:rFonts w:ascii="Arial" w:cs="Arial" w:eastAsia="Arial" w:hAnsi="Arial"/>
+        </w:rPr>
+        <w:t xml:space="preserve"> to send the goods back to us. If you collected from our warehouse, you can bring them back in person instead.</w:t>
+      </w:r>
+    </w:p>
+    <w:p>
+      <w:pPr>
+        <w:pStyle w:val="ListParagraph"/>
+        <w:numPr>
+          <w:ilvl w:val="0"/>
+          <w:numId w:val="2"/>
+        </w:numPr>
+        <w:spacing w:after="100" w:line="300"/>
+      </w:pPr>
+      <w:r>
+        <w:rPr>
+          <w:rFonts w:ascii="Arial" w:cs="Arial" w:eastAsia="Arial" w:hAnsi="Arial"/>
+        </w:rPr>
+        <w:t xml:space="preserve">We keep a </w:t>
+      </w:r>
+      <w:r>
+        <w:rPr>
+          <w:rFonts w:ascii="Arial" w:cs="Arial" w:eastAsia="Arial" w:hAnsi="Arial"/>
+          <w:b/>
+          <w:bCs/>
+        </w:rPr>
+        <w:t xml:space="preserve">20% restocking fee</w:t>
+      </w:r>
+      <w:r>
+        <w:rPr>
+          <w:rFonts w:ascii="Arial" w:cs="Arial" w:eastAsia="Arial" w:hAnsi="Arial"/>
+        </w:rPr>
+        <w:t xml:space="preserve">, calculated on the purchase price of the goods you return. For example, if you return a product that cost $100, we refund $80.</w:t>
+      </w:r>
+    </w:p>
+    <w:p>
+      <w:pPr>
+        <w:pStyle w:val="ListParagraph"/>
+        <w:numPr>
+          <w:ilvl w:val="0"/>
+          <w:numId w:val="2"/>
+        </w:numPr>
+        <w:spacing w:after="100" w:line="300"/>
+      </w:pPr>
+      <w:r>
+        <w:rPr>
+          <w:rFonts w:ascii="Arial" w:cs="Arial" w:eastAsia="Arial" w:hAnsi="Arial"/>
+          <w:b/>
+          <w:bCs/>
+        </w:rPr>
+        <w:t xml:space="preserve">Original delivery charges are not refunded.</w:t>
+      </w:r>
+      <w:r>
+        <w:rPr>
+          <w:rFonts w:ascii="Arial" w:cs="Arial" w:eastAsia="Arial" w:hAnsi="Arial"/>
+        </w:rPr>
+        <w:t xml:space="preserve"> </w:t>
       </w:r>
       <w:r>
         <w:rPr>
@@ -209,7 +357,7 @@
           <w:bCs/>
           <w:shd w:fill="FFF2B3" w:color="auto" w:val="clear"/>
         </w:rPr>
-        <w:t xml:space="preserve">[CONFIRM: unassembled only?]</w:t>
+        <w:t xml:space="preserve">[CONFIRM: this keeps the existing rule that the original postage and handling cost is not refunded. Delete this line if the 20% fee should replace it.]</w:t>
       </w:r>
     </w:p>
     <w:p>
@@ -225,15 +373,21 @@
         <w:rPr>
           <w:rFonts w:ascii="Arial" w:cs="Arial" w:eastAsia="Arial" w:hAnsi="Arial"/>
         </w:rPr>
-        <w:t xml:space="preserve">you contact us within the 14 days and </w:t>
-      </w:r>
-      <w:r>
-        <w:rPr>
-          <w:rFonts w:ascii="Arial" w:cs="Arial" w:eastAsia="Arial" w:hAnsi="Arial"/>
-          <w:b/>
-          <w:bCs/>
-        </w:rPr>
-        <w:t xml:space="preserve">wait for our return instructions before sending anything back</w:t>
+        <w:t xml:space="preserve">Once your return arrives we </w:t>
+      </w:r>
+      <w:r>
+        <w:rPr>
+          <w:rFonts w:ascii="Arial" w:cs="Arial" w:eastAsia="Arial" w:hAnsi="Arial"/>
+          <w:b/>
+          <w:bCs/>
+        </w:rPr>
+        <w:t xml:space="preserve">inspect it</w:t>
+      </w:r>
+      <w:r>
+        <w:rPr>
+          <w:rFonts w:ascii="Arial" w:cs="Arial" w:eastAsia="Arial" w:hAnsi="Arial"/>
+        </w:rPr>
+        <w:t xml:space="preserve">. If goods are damaged, parts are missing, or they were poorly packed and damaged on the way back, we may deduct a reasonable amount for the loss.</w:t>
       </w:r>
     </w:p>
     <w:p>
@@ -249,31 +403,21 @@
         <w:rPr>
           <w:rFonts w:ascii="Arial" w:cs="Arial" w:eastAsia="Arial" w:hAnsi="Arial"/>
         </w:rPr>
-        <w:t xml:space="preserve">you have your order number or proof of purchase</w:t>
-      </w:r>
-    </w:p>
-    <w:p>
-      <w:pPr>
-        <w:spacing w:after="160" w:line="300"/>
-      </w:pPr>
-      <w:r>
-        <w:rPr>
-          <w:rFonts w:ascii="Arial" w:cs="Arial" w:eastAsia="Arial" w:hAnsi="Arial"/>
-        </w:rPr>
-        <w:t xml:space="preserve">Products that are worn, damaged, modified, assembled or missing parts do not qualify for a change-of-mind return.</w:t>
-      </w:r>
-    </w:p>
-    <w:p>
-      <w:pPr>
-        <w:spacing w:after="160" w:line="300"/>
-      </w:pPr>
-      <w:r>
-        <w:rPr>
-          <w:rFonts w:ascii="Arial" w:cs="Arial" w:eastAsia="Arial" w:hAnsi="Arial"/>
-          <w:b/>
-          <w:bCs/>
-        </w:rPr>
-        <w:t xml:space="preserve">How the refund works</w:t>
+        <w:t xml:space="preserve">We refund to your </w:t>
+      </w:r>
+      <w:r>
+        <w:rPr>
+          <w:rFonts w:ascii="Arial" w:cs="Arial" w:eastAsia="Arial" w:hAnsi="Arial"/>
+          <w:b/>
+          <w:bCs/>
+        </w:rPr>
+        <w:t xml:space="preserve">original payment method within 7 days</w:t>
+      </w:r>
+      <w:r>
+        <w:rPr>
+          <w:rFonts w:ascii="Arial" w:cs="Arial" w:eastAsia="Arial" w:hAnsi="Arial"/>
+        </w:rPr>
+        <w:t xml:space="preserve"> of receiving and approving the return. Your bank or card provider may take extra time to show it. Afterpay refunds are processed through Afterpay.</w:t>
       </w:r>
     </w:p>
     <w:p>
@@ -289,7 +433,22 @@
         <w:rPr>
           <w:rFonts w:ascii="Arial" w:cs="Arial" w:eastAsia="Arial" w:hAnsi="Arial"/>
         </w:rPr>
-        <w:t xml:space="preserve">You pay to send the goods back to us, unless you collected them from our warehouse and bring them back in person.</w:t>
+        <w:t xml:space="preserve">If you paid by bank transfer, PayID or cash at pickup, we will refund in the same way </w:t>
+      </w:r>
+      <w:r>
+        <w:rPr>
+          <w:rFonts w:ascii="Arial" w:cs="Arial" w:eastAsia="Arial" w:hAnsi="Arial"/>
+          <w:b/>
+          <w:bCs/>
+          <w:shd w:fill="FFF2B3" w:color="auto" w:val="clear"/>
+        </w:rPr>
+        <w:t xml:space="preserve">[CONFIRM]</w:t>
+      </w:r>
+      <w:r>
+        <w:rPr>
+          <w:rFonts w:ascii="Arial" w:cs="Arial" w:eastAsia="Arial" w:hAnsi="Arial"/>
+        </w:rPr>
+        <w:t xml:space="preserve">.</w:t>
       </w:r>
     </w:p>
     <w:p>
@@ -305,174 +464,7 @@
         <w:rPr>
           <w:rFonts w:ascii="Arial" w:cs="Arial" w:eastAsia="Arial" w:hAnsi="Arial"/>
         </w:rPr>
-        <w:t xml:space="preserve">We refund the purchase price, less the </w:t>
-      </w:r>
-      <w:r>
-        <w:rPr>
-          <w:rFonts w:ascii="Arial" w:cs="Arial" w:eastAsia="Arial" w:hAnsi="Arial"/>
-          <w:b/>
-          <w:bCs/>
-        </w:rPr>
-        <w:t xml:space="preserve">original delivery and handling cost</w:t>
-      </w:r>
-      <w:r>
-        <w:rPr>
-          <w:rFonts w:ascii="Arial" w:cs="Arial" w:eastAsia="Arial" w:hAnsi="Arial"/>
-        </w:rPr>
-        <w:t xml:space="preserve"> we paid to send the order to you. </w:t>
-      </w:r>
-      <w:r>
-        <w:rPr>
-          <w:rFonts w:ascii="Arial" w:cs="Arial" w:eastAsia="Arial" w:hAnsi="Arial"/>
-          <w:b/>
-          <w:bCs/>
-          <w:shd w:fill="FFF2B3" w:color="auto" w:val="clear"/>
-        </w:rPr>
-        <w:t xml:space="preserve">[OPTIONAL: and less a restocking fee of [X]</w:t>
-      </w:r>
-      <w:r>
-        <w:rPr>
-          <w:rFonts w:ascii="Arial" w:cs="Arial" w:eastAsia="Arial" w:hAnsi="Arial"/>
-          <w:b/>
-          <w:bCs/>
-        </w:rPr>
-        <w:t xml:space="preserve">% - other retailers charge 20-30%. Delete this line if you don't want a fee.]</w:t>
-      </w:r>
-    </w:p>
-    <w:p>
-      <w:pPr>
-        <w:pStyle w:val="ListParagraph"/>
-        <w:numPr>
-          <w:ilvl w:val="0"/>
-          <w:numId w:val="2"/>
-        </w:numPr>
-        <w:spacing w:after="100" w:line="300"/>
-      </w:pPr>
-      <w:r>
-        <w:rPr>
-          <w:rFonts w:ascii="Arial" w:cs="Arial" w:eastAsia="Arial" w:hAnsi="Arial"/>
-        </w:rPr>
-        <w:t xml:space="preserve">Once your return arrives we </w:t>
-      </w:r>
-      <w:r>
-        <w:rPr>
-          <w:rFonts w:ascii="Arial" w:cs="Arial" w:eastAsia="Arial" w:hAnsi="Arial"/>
-          <w:b/>
-          <w:bCs/>
-        </w:rPr>
-        <w:t xml:space="preserve">inspect it</w:t>
-      </w:r>
-      <w:r>
-        <w:rPr>
-          <w:rFonts w:ascii="Arial" w:cs="Arial" w:eastAsia="Arial" w:hAnsi="Arial"/>
-        </w:rPr>
-        <w:t xml:space="preserve">. If goods are damaged, or parts are missing, or they were poorly packed and damaged on the way back, we may deduct a reasonable amount for the loss.</w:t>
-      </w:r>
-    </w:p>
-    <w:p>
-      <w:pPr>
-        <w:pStyle w:val="ListParagraph"/>
-        <w:numPr>
-          <w:ilvl w:val="0"/>
-          <w:numId w:val="2"/>
-        </w:numPr>
-        <w:spacing w:after="100" w:line="300"/>
-      </w:pPr>
-      <w:r>
-        <w:rPr>
-          <w:rFonts w:ascii="Arial" w:cs="Arial" w:eastAsia="Arial" w:hAnsi="Arial"/>
-        </w:rPr>
-        <w:t xml:space="preserve">We refund to your </w:t>
-      </w:r>
-      <w:r>
-        <w:rPr>
-          <w:rFonts w:ascii="Arial" w:cs="Arial" w:eastAsia="Arial" w:hAnsi="Arial"/>
-          <w:b/>
-          <w:bCs/>
-        </w:rPr>
-        <w:t xml:space="preserve">original payment method</w:t>
-      </w:r>
-      <w:r>
-        <w:rPr>
-          <w:rFonts w:ascii="Arial" w:cs="Arial" w:eastAsia="Arial" w:hAnsi="Arial"/>
-        </w:rPr>
-        <w:t xml:space="preserve"> within </w:t>
-      </w:r>
-      <w:r>
-        <w:rPr>
-          <w:rFonts w:ascii="Arial" w:cs="Arial" w:eastAsia="Arial" w:hAnsi="Arial"/>
-          <w:b/>
-          <w:bCs/>
-        </w:rPr>
-        <w:t xml:space="preserve">5 business days</w:t>
-      </w:r>
-      <w:r>
-        <w:rPr>
-          <w:rFonts w:ascii="Arial" w:cs="Arial" w:eastAsia="Arial" w:hAnsi="Arial"/>
-        </w:rPr>
-        <w:t xml:space="preserve"> of approving the refund </w:t>
-      </w:r>
-      <w:r>
-        <w:rPr>
-          <w:rFonts w:ascii="Arial" w:cs="Arial" w:eastAsia="Arial" w:hAnsi="Arial"/>
-          <w:b/>
-          <w:bCs/>
-          <w:shd w:fill="FFF2B3" w:color="auto" w:val="clear"/>
-        </w:rPr>
-        <w:t xml:space="preserve">[CONFIRM]</w:t>
-      </w:r>
-      <w:r>
-        <w:rPr>
-          <w:rFonts w:ascii="Arial" w:cs="Arial" w:eastAsia="Arial" w:hAnsi="Arial"/>
-        </w:rPr>
-        <w:t xml:space="preserve">. Your bank or card provider may take extra time to show it. Afterpay refunds are processed through Afterpay.</w:t>
-      </w:r>
-    </w:p>
-    <w:p>
-      <w:pPr>
-        <w:pStyle w:val="ListParagraph"/>
-        <w:numPr>
-          <w:ilvl w:val="0"/>
-          <w:numId w:val="2"/>
-        </w:numPr>
-        <w:spacing w:after="100" w:line="300"/>
-      </w:pPr>
-      <w:r>
-        <w:rPr>
-          <w:rFonts w:ascii="Arial" w:cs="Arial" w:eastAsia="Arial" w:hAnsi="Arial"/>
-        </w:rPr>
-        <w:t xml:space="preserve">If you paid by bank transfer, PayID or cash at pickup, we will refund in the same way </w:t>
-      </w:r>
-      <w:r>
-        <w:rPr>
-          <w:rFonts w:ascii="Arial" w:cs="Arial" w:eastAsia="Arial" w:hAnsi="Arial"/>
-          <w:b/>
-          <w:bCs/>
-          <w:shd w:fill="FFF2B3" w:color="auto" w:val="clear"/>
-        </w:rPr>
-        <w:t xml:space="preserve">[CONFIRM]</w:t>
-      </w:r>
-      <w:r>
-        <w:rPr>
-          <w:rFonts w:ascii="Arial" w:cs="Arial" w:eastAsia="Arial" w:hAnsi="Arial"/>
-        </w:rPr>
-        <w:t xml:space="preserve">.</w:t>
-      </w:r>
-    </w:p>
-    <w:p>
-      <w:pPr>
-        <w:pStyle w:val="ListParagraph"/>
-        <w:numPr>
-          <w:ilvl w:val="0"/>
-          <w:numId w:val="2"/>
-        </w:numPr>
-        <w:spacing w:after="100" w:line="300"/>
-      </w:pPr>
-      <w:r>
-        <w:rPr>
-          <w:rFonts w:ascii="Arial" w:cs="Arial" w:eastAsia="Arial" w:hAnsi="Arial"/>
-        </w:rPr>
-        <w:t xml:space="preserve">If you have not received an approved refund after 7 days, check with your bank first, then contact us.</w:t>
+        <w:t xml:space="preserve">If your refund has not shown up 7 days after we tell you it has been processed, check with your bank first, then contact us.</w:t>
       </w:r>
     </w:p>
     <w:p>
@@ -562,6 +554,25 @@
     </w:p>
     <w:p>
       <w:pPr>
+        <w:pStyle w:val="ListParagraph"/>
+        <w:numPr>
+          <w:ilvl w:val="0"/>
+          <w:numId w:val="2"/>
+        </w:numPr>
+        <w:spacing w:after="100" w:line="300"/>
+      </w:pPr>
+      <w:r>
+        <w:rPr>
+          <w:rFonts w:ascii="Arial" w:cs="Arial" w:eastAsia="Arial" w:hAnsi="Arial"/>
+          <w:b/>
+          <w:bCs/>
+          <w:shd w:fill="FFF2B3" w:color="auto" w:val="clear"/>
+        </w:rPr>
+        <w:t xml:space="preserve">[CONFIRM: no 20% restocking fee applies to a straight exchange]</w:t>
+      </w:r>
+    </w:p>
+    <w:p>
+      <w:pPr>
         <w:pStyle w:val="Heading2"/>
         <w:keepNext/>
         <w:spacing w:after="120" w:before="280"/>
@@ -616,38 +627,14 @@
           <w:rFonts w:ascii="Arial" w:cs="Arial" w:eastAsia="Arial" w:hAnsi="Arial"/>
           <w:b/>
           <w:bCs/>
-          <w:shd w:fill="FFF2B3" w:color="auto" w:val="clear"/>
-        </w:rPr>
-        <w:t xml:space="preserve">[7]</w:t>
-      </w:r>
-      <w:r>
-        <w:rPr>
-          <w:rFonts w:ascii="Arial" w:cs="Arial" w:eastAsia="Arial" w:hAnsi="Arial"/>
-          <w:b/>
-          <w:bCs/>
-        </w:rPr>
-        <w:t xml:space="preserve"> days</w:t>
-      </w:r>
-      <w:r>
-        <w:rPr>
-          <w:rFonts w:ascii="Arial" w:cs="Arial" w:eastAsia="Arial" w:hAnsi="Arial"/>
-        </w:rPr>
-        <w:t xml:space="preserve"> of receiving it </w:t>
-      </w:r>
-      <w:r>
-        <w:rPr>
-          <w:rFonts w:ascii="Arial" w:cs="Arial" w:eastAsia="Arial" w:hAnsi="Arial"/>
-          <w:b/>
-          <w:bCs/>
-          <w:shd w:fill="FFF2B3" w:color="auto" w:val="clear"/>
-        </w:rPr>
-        <w:t xml:space="preserve">[CONFIRM period]</w:t>
-      </w:r>
-      <w:r>
-        <w:rPr>
-          <w:rFonts w:ascii="Arial" w:cs="Arial" w:eastAsia="Arial" w:hAnsi="Arial"/>
-        </w:rPr>
-        <w:t xml:space="preserve"> - by email at Edwin_10@live.com.au, on +61 431 533 520, or through our Contact Us page. This is a request, not a deadline: it does not limit your rights under the Australian Consumer Law.</w:t>
+        </w:rPr>
+        <w:t xml:space="preserve">7 days</w:t>
+      </w:r>
+      <w:r>
+        <w:rPr>
+          <w:rFonts w:ascii="Arial" w:cs="Arial" w:eastAsia="Arial" w:hAnsi="Arial"/>
+        </w:rPr>
+        <w:t xml:space="preserve"> of receiving it - by email at Edwin_10@live.com.au, on +61 431 533 520, or through our Contact Us page. This is a request, not a deadline: it does not limit your rights under the Australian Consumer Law.</w:t>
       </w:r>
     </w:p>
     <w:p>
@@ -805,7 +792,40 @@
         <w:rPr>
           <w:rFonts w:ascii="Arial" w:cs="Arial" w:eastAsia="Arial" w:hAnsi="Arial"/>
         </w:rPr>
-        <w:t xml:space="preserve">We cover the cost of returning goods that are faulty, damaged or not as described. If, after inspection, a product turns out not to be faulty, we may ask you to cover reasonable inspection and return costs </w:t>
+        <w:t xml:space="preserve">We cover the cost of returning goods that are faulty, damaged or not as described.</w:t>
+      </w:r>
+    </w:p>
+    <w:p>
+      <w:pPr>
+        <w:spacing w:after="160" w:line="300"/>
+      </w:pPr>
+      <w:r>
+        <w:rPr>
+          <w:rFonts w:ascii="Arial" w:cs="Arial" w:eastAsia="Arial" w:hAnsi="Arial"/>
+          <w:b/>
+          <w:bCs/>
+        </w:rPr>
+        <w:t xml:space="preserve">If we inspect a product and it is not faulty:</w:t>
+      </w:r>
+      <w:r>
+        <w:rPr>
+          <w:rFonts w:ascii="Arial" w:cs="Arial" w:eastAsia="Arial" w:hAnsi="Arial"/>
+        </w:rPr>
+        <w:t xml:space="preserve"> we will tell you what we found. You can then choose to </w:t>
+      </w:r>
+      <w:r>
+        <w:rPr>
+          <w:rFonts w:ascii="Arial" w:cs="Arial" w:eastAsia="Arial" w:hAnsi="Arial"/>
+          <w:b/>
+          <w:bCs/>
+        </w:rPr>
+        <w:t xml:space="preserve">pay the freight to have it delivered back to you</w:t>
+      </w:r>
+      <w:r>
+        <w:rPr>
+          <w:rFonts w:ascii="Arial" w:cs="Arial" w:eastAsia="Arial" w:hAnsi="Arial"/>
+        </w:rPr>
+        <w:t xml:space="preserve">. If you would rather not, we will keep the returned product and you will not be charged anything further. </w:t>
       </w:r>
       <w:r>
         <w:rPr>
@@ -814,13 +834,13 @@
           <w:bCs/>
           <w:shd w:fill="FFF2B3" w:color="auto" w:val="clear"/>
         </w:rPr>
-        <w:t xml:space="preserve">[CONFIRM: to the extent the law allows]</w:t>
-      </w:r>
-      <w:r>
-        <w:rPr>
-          <w:rFonts w:ascii="Arial" w:cs="Arial" w:eastAsia="Arial" w:hAnsi="Arial"/>
-        </w:rPr>
-        <w:t xml:space="preserve">.</w:t>
+        <w:t xml:space="preserve">[LAWYER TO CHECK: keeping a customer's goods without a refund when they were sent in under a fault claim. Consider adding a time limit, for example "if we do not hear from you within 30 days".]</w:t>
+      </w:r>
+      <w:r>
+        <w:rPr>
+          <w:rFonts w:ascii="Arial" w:cs="Arial" w:eastAsia="Arial" w:hAnsi="Arial"/>
+        </w:rPr>
+        <w:t xml:space="preserve"> If the product is still within the 14-day change-of-mind period and meets the conditions in section 2, you may choose to treat it as a change-of-mind return instead.</w:t>
       </w:r>
     </w:p>
     <w:p>
@@ -897,7 +917,21 @@
         <w:rPr>
           <w:rFonts w:ascii="Arial" w:cs="Arial" w:eastAsia="Arial" w:hAnsi="Arial"/>
         </w:rPr>
-        <w:t xml:space="preserve"> we can usually cancel it and refund you in full </w:t>
+        <w:t xml:space="preserve"> we can cancel it. We keep </w:t>
+      </w:r>
+      <w:r>
+        <w:rPr>
+          <w:rFonts w:ascii="Arial" w:cs="Arial" w:eastAsia="Arial" w:hAnsi="Arial"/>
+          <w:b/>
+          <w:bCs/>
+        </w:rPr>
+        <w:t xml:space="preserve">20% of the order total</w:t>
+      </w:r>
+      <w:r>
+        <w:rPr>
+          <w:rFonts w:ascii="Arial" w:cs="Arial" w:eastAsia="Arial" w:hAnsi="Arial"/>
+        </w:rPr>
+        <w:t xml:space="preserve">, and refund the rest. </w:t>
       </w:r>
       <w:r>
         <w:rPr>
@@ -906,21 +940,7 @@
           <w:bCs/>
           <w:shd w:fill="FFF2B3" w:color="auto" w:val="clear"/>
         </w:rPr>
-        <w:t xml:space="preserve">[CONFIRM: or deduct payment processing fees of about [X]</w:t>
-      </w:r>
-      <w:r>
-        <w:rPr>
-          <w:rFonts w:ascii="Arial" w:cs="Arial" w:eastAsia="Arial" w:hAnsi="Arial"/>
-          <w:b/>
-          <w:bCs/>
-        </w:rPr>
-        <w:t xml:space="preserve">%]</w:t>
-      </w:r>
-      <w:r>
-        <w:rPr>
-          <w:rFonts w:ascii="Arial" w:cs="Arial" w:eastAsia="Arial" w:hAnsi="Arial"/>
-        </w:rPr>
-        <w:t xml:space="preserve">.</w:t>
+        <w:t xml:space="preserve">[LAWYER TO CHECK: a 20% fee for cancelling before dispatch is higher than the 3% charged by one other retailer we looked at, and could be seen as unreasonable if it is more than your actual costs. Consider a lower fee.]</w:t>
       </w:r>
     </w:p>
     <w:p>
@@ -988,7 +1008,7 @@
         <w:rPr>
           <w:rFonts w:ascii="Arial" w:cs="Arial" w:eastAsia="Arial" w:hAnsi="Arial"/>
         </w:rPr>
-        <w:t xml:space="preserve">products that are damaged, used, assembled or modified after delivery or collection</w:t>
+        <w:t xml:space="preserve">products that have been opened, assembled, used, damaged or modified after delivery or collection</w:t>
       </w:r>
     </w:p>
     <w:p>
@@ -1003,91 +1023,8 @@
       <w:r>
         <w:rPr>
           <w:rFonts w:ascii="Arial" w:cs="Arial" w:eastAsia="Arial" w:hAnsi="Arial"/>
-          <w:b/>
-          <w:bCs/>
-        </w:rPr>
-        <w:t xml:space="preserve">sale or clearance items</w:t>
-      </w:r>
-      <w:r>
-        <w:rPr>
-          <w:rFonts w:ascii="Arial" w:cs="Arial" w:eastAsia="Arial" w:hAnsi="Arial"/>
-        </w:rPr>
-        <w:t xml:space="preserve"> </w:t>
-      </w:r>
-      <w:r>
-        <w:rPr>
-          <w:rFonts w:ascii="Arial" w:cs="Arial" w:eastAsia="Arial" w:hAnsi="Arial"/>
-          <w:b/>
-          <w:bCs/>
-          <w:shd w:fill="FFF2B3" w:color="auto" w:val="clear"/>
-        </w:rPr>
-        <w:t xml:space="preserve">[CONFIRM if you run any]</w:t>
-      </w:r>
-    </w:p>
-    <w:p>
-      <w:pPr>
-        <w:pStyle w:val="ListParagraph"/>
-        <w:numPr>
-          <w:ilvl w:val="0"/>
-          <w:numId w:val="2"/>
-        </w:numPr>
-        <w:spacing w:after="100" w:line="300"/>
-      </w:pPr>
-      <w:r>
-        <w:rPr>
-          <w:rFonts w:ascii="Arial" w:cs="Arial" w:eastAsia="Arial" w:hAnsi="Arial"/>
-          <w:b/>
-          <w:bCs/>
-        </w:rPr>
-        <w:t xml:space="preserve">custom or special-order items</w:t>
-      </w:r>
-      <w:r>
-        <w:rPr>
-          <w:rFonts w:ascii="Arial" w:cs="Arial" w:eastAsia="Arial" w:hAnsi="Arial"/>
-        </w:rPr>
-        <w:t xml:space="preserve"> </w:t>
-      </w:r>
-      <w:r>
-        <w:rPr>
-          <w:rFonts w:ascii="Arial" w:cs="Arial" w:eastAsia="Arial" w:hAnsi="Arial"/>
-          <w:b/>
-          <w:bCs/>
-          <w:shd w:fill="FFF2B3" w:color="auto" w:val="clear"/>
-        </w:rPr>
-        <w:t xml:space="preserve">[CONFIRM if you offer any]</w:t>
-      </w:r>
-    </w:p>
-    <w:p>
-      <w:pPr>
-        <w:pStyle w:val="ListParagraph"/>
-        <w:numPr>
-          <w:ilvl w:val="0"/>
-          <w:numId w:val="2"/>
-        </w:numPr>
-        <w:spacing w:after="100" w:line="300"/>
-      </w:pPr>
-      <w:r>
-        <w:rPr>
-          <w:rFonts w:ascii="Arial" w:cs="Arial" w:eastAsia="Arial" w:hAnsi="Arial"/>
-          <w:b/>
-          <w:bCs/>
-        </w:rPr>
-        <w:t xml:space="preserve">gift cards</w:t>
-      </w:r>
-      <w:r>
-        <w:rPr>
-          <w:rFonts w:ascii="Arial" w:cs="Arial" w:eastAsia="Arial" w:hAnsi="Arial"/>
-        </w:rPr>
-        <w:t xml:space="preserve"> </w:t>
-      </w:r>
-      <w:r>
-        <w:rPr>
-          <w:rFonts w:ascii="Arial" w:cs="Arial" w:eastAsia="Arial" w:hAnsi="Arial"/>
-          <w:b/>
-          <w:bCs/>
-          <w:shd w:fill="FFF2B3" w:color="auto" w:val="clear"/>
-        </w:rPr>
-        <w:t xml:space="preserve">[CONFIRM if you sell any]</w:t>
+        </w:rPr>
+        <w:t xml:space="preserve">products with parts missing</w:t>
       </w:r>
     </w:p>
     <w:p>
@@ -1169,7 +1106,21 @@
         <w:rPr>
           <w:rFonts w:ascii="Arial" w:cs="Arial" w:eastAsia="Arial" w:hAnsi="Arial"/>
         </w:rPr>
-        <w:t xml:space="preserve">, including the address to send goods to </w:t>
+        <w:t xml:space="preserve">, including the address to send goods to: </w:t>
+      </w:r>
+      <w:r>
+        <w:rPr>
+          <w:rFonts w:ascii="Arial" w:cs="Arial" w:eastAsia="Arial" w:hAnsi="Arial"/>
+          <w:b/>
+          <w:bCs/>
+        </w:rPr>
+        <w:t xml:space="preserve">Super Shelving, 4 Ardmillan Road, Moonee Ponds VIC 3039</w:t>
+      </w:r>
+      <w:r>
+        <w:rPr>
+          <w:rFonts w:ascii="Arial" w:cs="Arial" w:eastAsia="Arial" w:hAnsi="Arial"/>
+        </w:rPr>
+        <w:t xml:space="preserve">. </w:t>
       </w:r>
       <w:r>
         <w:rPr>
@@ -1178,13 +1129,7 @@
           <w:bCs/>
           <w:shd w:fill="FFF2B3" w:color="auto" w:val="clear"/>
         </w:rPr>
-        <w:t xml:space="preserve">[CONFIRM: Moonee Ponds warehouse, 4 Ardmillan Road, Moonee Ponds VIC 3039]</w:t>
-      </w:r>
-      <w:r>
-        <w:rPr>
-          <w:rFonts w:ascii="Arial" w:cs="Arial" w:eastAsia="Arial" w:hAnsi="Arial"/>
-        </w:rPr>
-        <w:t xml:space="preserve">.</w:t>
+        <w:t xml:space="preserve">[This address will be updated later.]</w:t>
       </w:r>
     </w:p>
     <w:p>
@@ -1202,7 +1147,7 @@
           <w:b/>
           <w:bCs/>
         </w:rPr>
-        <w:t xml:space="preserve">Pack the goods securely in their original packaging.</w:t>
+        <w:t xml:space="preserve">Pack the goods securely in their original boxes.</w:t>
       </w:r>
       <w:r>
         <w:rPr>

</xml_diff>

<commit_message>
Returns policy v4: 5% cancellation fee before dispatch
Co-Authored-By: Claude Sonnet 5.5 <noreply@anthropic.com>
</commit_message>
<xml_diff>
--- a/docs/policy-drafts/returns-policy.docx
+++ b/docs/policy-drafts/returns-policy.docx
@@ -35,7 +35,7 @@
           <w:sz w:val="20"/>
           <w:szCs w:val="20"/>
         </w:rPr>
-        <w:t xml:space="preserve">Draft for review (version 3).</w:t>
+        <w:t xml:space="preserve">Draft for review (version 4).</w:t>
       </w:r>
       <w:r>
         <w:rPr>
@@ -925,13 +925,13 @@
           <w:b/>
           <w:bCs/>
         </w:rPr>
-        <w:t xml:space="preserve">20% of the order total</w:t>
-      </w:r>
-      <w:r>
-        <w:rPr>
-          <w:rFonts w:ascii="Arial" w:cs="Arial" w:eastAsia="Arial" w:hAnsi="Arial"/>
-        </w:rPr>
-        <w:t xml:space="preserve">, and refund the rest. </w:t>
+        <w:t xml:space="preserve">5% of the order total</w:t>
+      </w:r>
+      <w:r>
+        <w:rPr>
+          <w:rFonts w:ascii="Arial" w:cs="Arial" w:eastAsia="Arial" w:hAnsi="Arial"/>
+        </w:rPr>
+        <w:t xml:space="preserve"> to cover payment-processing and handling costs, and refund the rest. </w:t>
       </w:r>
       <w:r>
         <w:rPr>
@@ -940,7 +940,7 @@
           <w:bCs/>
           <w:shd w:fill="FFF2B3" w:color="auto" w:val="clear"/>
         </w:rPr>
-        <w:t xml:space="preserve">[LAWYER TO CHECK: a 20% fee for cancelling before dispatch is higher than the 3% charged by one other retailer we looked at, and could be seen as unreasonable if it is more than your actual costs. Consider a lower fee.]</w:t>
+        <w:t xml:space="preserve">[LAWYER TO CHECK: confirm the 5% fee reasonably reflects your actual costs of processing a cancelled order.]</w:t>
       </w:r>
     </w:p>
     <w:p>

</xml_diff>

<commit_message>
Rename 20% fee to restocking and handling fee in Returns policy and Terms
Co-Authored-By: Claude Sonnet 5.5 <noreply@anthropic.com>
</commit_message>
<xml_diff>
--- a/docs/policy-drafts/returns-policy.docx
+++ b/docs/policy-drafts/returns-policy.docx
@@ -35,7 +35,7 @@
           <w:sz w:val="20"/>
           <w:szCs w:val="20"/>
         </w:rPr>
-        <w:t xml:space="preserve">Draft for review (version 4).</w:t>
+        <w:t xml:space="preserve">Draft for review (version 5).</w:t>
       </w:r>
       <w:r>
         <w:rPr>
@@ -318,13 +318,13 @@
           <w:b/>
           <w:bCs/>
         </w:rPr>
-        <w:t xml:space="preserve">20% restocking fee</w:t>
-      </w:r>
-      <w:r>
-        <w:rPr>
-          <w:rFonts w:ascii="Arial" w:cs="Arial" w:eastAsia="Arial" w:hAnsi="Arial"/>
-        </w:rPr>
-        <w:t xml:space="preserve">, calculated on the purchase price of the goods you return. For example, if you return a product that cost $100, we refund $80.</w:t>
+        <w:t xml:space="preserve">20% restocking and handling fee</w:t>
+      </w:r>
+      <w:r>
+        <w:rPr>
+          <w:rFonts w:ascii="Arial" w:cs="Arial" w:eastAsia="Arial" w:hAnsi="Arial"/>
+        </w:rPr>
+        <w:t xml:space="preserve">, calculated on the purchase price of the goods you return. It covers the cost of receiving, inspecting, handling and re-shelving the goods. For example, if you return a product that cost $100, we refund $80.</w:t>
       </w:r>
     </w:p>
     <w:p>
@@ -568,7 +568,7 @@
           <w:bCs/>
           <w:shd w:fill="FFF2B3" w:color="auto" w:val="clear"/>
         </w:rPr>
-        <w:t xml:space="preserve">[CONFIRM: no 20% restocking fee applies to a straight exchange]</w:t>
+        <w:t xml:space="preserve">[CONFIRM: no 20% restocking and handling fee applies to a straight exchange]</w:t>
       </w:r>
     </w:p>
     <w:p>

</xml_diff>

<commit_message>
Returns policy v6: we arrange courier collection for faulty items
Co-Authored-By: Claude Sonnet 5.5 <noreply@anthropic.com>
</commit_message>
<xml_diff>
--- a/docs/policy-drafts/returns-policy.docx
+++ b/docs/policy-drafts/returns-policy.docx
@@ -35,7 +35,7 @@
           <w:sz w:val="20"/>
           <w:szCs w:val="20"/>
         </w:rPr>
-        <w:t xml:space="preserve">Draft for review (version 5).</w:t>
+        <w:t xml:space="preserve">Draft for review (version 6).</w:t>
       </w:r>
       <w:r>
         <w:rPr>
@@ -746,7 +746,21 @@
         <w:rPr>
           <w:rFonts w:ascii="Arial" w:cs="Arial" w:eastAsia="Arial" w:hAnsi="Arial"/>
         </w:rPr>
-        <w:t xml:space="preserve">We may ask you to send the product back, or arrange to inspect it, before approving a remedy.</w:t>
+        <w:t xml:space="preserve">If we need the product back, </w:t>
+      </w:r>
+      <w:r>
+        <w:rPr>
+          <w:rFonts w:ascii="Arial" w:cs="Arial" w:eastAsia="Arial" w:hAnsi="Arial"/>
+          <w:b/>
+          <w:bCs/>
+        </w:rPr>
+        <w:t xml:space="preserve">we will arrange the return for you</w:t>
+      </w:r>
+      <w:r>
+        <w:rPr>
+          <w:rFonts w:ascii="Arial" w:cs="Arial" w:eastAsia="Arial" w:hAnsi="Arial"/>
+        </w:rPr>
+        <w:t xml:space="preserve"> - we will book a courier to collect it from you at our cost, and tell you when to have it ready. Please do not send faulty goods back yourself unless we ask you to. We may also arrange to inspect the product where it is.</w:t>
       </w:r>
     </w:p>
     <w:p>
@@ -792,7 +806,7 @@
         <w:rPr>
           <w:rFonts w:ascii="Arial" w:cs="Arial" w:eastAsia="Arial" w:hAnsi="Arial"/>
         </w:rPr>
-        <w:t xml:space="preserve">We cover the cost of returning goods that are faulty, damaged or not as described.</w:t>
+        <w:t xml:space="preserve">We cover the cost of returning goods that are faulty, damaged or not as described, and we arrange the courier collection.</w:t>
       </w:r>
     </w:p>
     <w:p>
@@ -1052,7 +1066,18 @@
           <w:sz w:val="26"/>
           <w:szCs w:val="26"/>
         </w:rPr>
-        <w:t xml:space="preserve">7. How to start a return</w:t>
+        <w:t xml:space="preserve">7. How to start a change-of-mind return</w:t>
+      </w:r>
+    </w:p>
+    <w:p>
+      <w:pPr>
+        <w:spacing w:after="160" w:line="300"/>
+      </w:pPr>
+      <w:r>
+        <w:rPr>
+          <w:rFonts w:ascii="Arial" w:cs="Arial" w:eastAsia="Arial" w:hAnsi="Arial"/>
+        </w:rPr>
+        <w:t xml:space="preserve">(For faulty, damaged or incorrect products, see section 4 - we arrange the return for you.)</w:t>
       </w:r>
     </w:p>
     <w:p>

</xml_diff>

<commit_message>
Returns policy: contact us first for faulty returns; whole unit vs single part
Co-Authored-By: Claude Sonnet 5.5 <noreply@anthropic.com>
</commit_message>
<xml_diff>
--- a/docs/policy-drafts/returns-policy.docx
+++ b/docs/policy-drafts/returns-policy.docx
@@ -745,22 +745,96 @@
       <w:r>
         <w:rPr>
           <w:rFonts w:ascii="Arial" w:cs="Arial" w:eastAsia="Arial" w:hAnsi="Arial"/>
-        </w:rPr>
-        <w:t xml:space="preserve">If we need the product back, </w:t>
-      </w:r>
-      <w:r>
-        <w:rPr>
-          <w:rFonts w:ascii="Arial" w:cs="Arial" w:eastAsia="Arial" w:hAnsi="Arial"/>
-          <w:b/>
-          <w:bCs/>
-        </w:rPr>
-        <w:t xml:space="preserve">we will arrange the return for you</w:t>
-      </w:r>
-      <w:r>
-        <w:rPr>
-          <w:rFonts w:ascii="Arial" w:cs="Arial" w:eastAsia="Arial" w:hAnsi="Arial"/>
-        </w:rPr>
-        <w:t xml:space="preserve"> - we will book a courier to collect it from you at our cost, and tell you when to have it ready. Please do not send faulty goods back yourself unless we ask you to. We may also arrange to inspect the product where it is.</w:t>
+          <w:b/>
+          <w:bCs/>
+        </w:rPr>
+        <w:t xml:space="preserve">Contact us before sending anything back.</w:t>
+      </w:r>
+      <w:r>
+        <w:rPr>
+          <w:rFonts w:ascii="Arial" w:cs="Arial" w:eastAsia="Arial" w:hAnsi="Arial"/>
+        </w:rPr>
+        <w:t xml:space="preserve"> What we do depends on what is wrong:</w:t>
+      </w:r>
+    </w:p>
+    <w:p>
+      <w:pPr>
+        <w:pStyle w:val="ListParagraph"/>
+        <w:numPr>
+          <w:ilvl w:val="1"/>
+          <w:numId w:val="2"/>
+        </w:numPr>
+        <w:spacing w:after="80" w:line="300"/>
+      </w:pPr>
+      <w:r>
+        <w:rPr>
+          <w:rFonts w:ascii="Arial" w:cs="Arial" w:eastAsia="Arial" w:hAnsi="Arial"/>
+          <w:b/>
+          <w:bCs/>
+        </w:rPr>
+        <w:t xml:space="preserve">A single part:</w:t>
+      </w:r>
+      <w:r>
+        <w:rPr>
+          <w:rFonts w:ascii="Arial" w:cs="Arial" w:eastAsia="Arial" w:hAnsi="Arial"/>
+        </w:rPr>
+        <w:t xml:space="preserve"> we may send you a replacement part, and may not need the old part back.</w:t>
+      </w:r>
+    </w:p>
+    <w:p>
+      <w:pPr>
+        <w:pStyle w:val="ListParagraph"/>
+        <w:numPr>
+          <w:ilvl w:val="1"/>
+          <w:numId w:val="2"/>
+        </w:numPr>
+        <w:spacing w:after="80" w:line="300"/>
+      </w:pPr>
+      <w:r>
+        <w:rPr>
+          <w:rFonts w:ascii="Arial" w:cs="Arial" w:eastAsia="Arial" w:hAnsi="Arial"/>
+          <w:b/>
+          <w:bCs/>
+        </w:rPr>
+        <w:t xml:space="preserve">The whole unit:</w:t>
+      </w:r>
+      <w:r>
+        <w:rPr>
+          <w:rFonts w:ascii="Arial" w:cs="Arial" w:eastAsia="Arial" w:hAnsi="Arial"/>
+        </w:rPr>
+        <w:t xml:space="preserve"> we will agree the details of the return with you, and arrange the return at our cost.</w:t>
+      </w:r>
+    </w:p>
+    <w:p>
+      <w:pPr>
+        <w:pStyle w:val="ListParagraph"/>
+        <w:numPr>
+          <w:ilvl w:val="1"/>
+          <w:numId w:val="2"/>
+        </w:numPr>
+        <w:spacing w:after="80" w:line="300"/>
+      </w:pPr>
+      <w:r>
+        <w:rPr>
+          <w:rFonts w:ascii="Arial" w:cs="Arial" w:eastAsia="Arial" w:hAnsi="Arial"/>
+        </w:rPr>
+        <w:t xml:space="preserve">We may also arrange to inspect the product where it is.</w:t>
+      </w:r>
+    </w:p>
+    <w:p>
+      <w:pPr>
+        <w:pStyle w:val="ListParagraph"/>
+        <w:numPr>
+          <w:ilvl w:val="1"/>
+          <w:numId w:val="2"/>
+        </w:numPr>
+        <w:spacing w:after="80" w:line="300"/>
+      </w:pPr>
+      <w:r>
+        <w:rPr>
+          <w:rFonts w:ascii="Arial" w:cs="Arial" w:eastAsia="Arial" w:hAnsi="Arial"/>
+        </w:rPr>
+        <w:t xml:space="preserve">Please do not send faulty goods back yourself unless we ask you to.</w:t>
       </w:r>
     </w:p>
     <w:p>
@@ -806,7 +880,7 @@
         <w:rPr>
           <w:rFonts w:ascii="Arial" w:cs="Arial" w:eastAsia="Arial" w:hAnsi="Arial"/>
         </w:rPr>
-        <w:t xml:space="preserve">We cover the cost of returning goods that are faulty, damaged or not as described, and we arrange the courier collection.</w:t>
+        <w:t xml:space="preserve">We cover the cost of returning goods that are faulty, damaged or not as described. We will agree how the return happens with you first.</w:t>
       </w:r>
     </w:p>
     <w:p>

</xml_diff>